<commit_message>
CS1105 Unit 4: use block paragraphs in Word output to match earlier units
Co-Authored-By: Claude Opus 5.5 <noreply@anthropic.com>
</commit_message>
<xml_diff>
--- a/CS1105_Digital_Electronics_Architecture/Unit4_Computer_Arithmetic/Assignment/Unit4_Assignment_Activity.docx
+++ b/CS1105_Digital_Electronics_Architecture/Unit4_Computer_Arithmetic/Assignment/Unit4_Assignment_Activity.docx
@@ -139,8 +139,7 @@
     </w:p>
     <w:p>
       <w:pPr>
-        <w:spacing w:line="480" w:lineRule="auto" w:after="0"/>
-        <w:ind w:firstLine="720"/>
+        <w:spacing w:line="480" w:lineRule="auto" w:after="200"/>
       </w:pPr>
       <w:r>
         <w:rPr>
@@ -154,8 +153,7 @@
     </w:p>
     <w:p>
       <w:pPr>
-        <w:spacing w:line="480" w:lineRule="auto" w:after="0"/>
-        <w:ind w:firstLine="720"/>
+        <w:spacing w:line="480" w:lineRule="auto" w:after="200"/>
       </w:pPr>
       <w:r>
         <w:rPr>
@@ -198,8 +196,7 @@
     </w:p>
     <w:p>
       <w:pPr>
-        <w:spacing w:line="480" w:lineRule="auto" w:after="0"/>
-        <w:ind w:firstLine="720"/>
+        <w:spacing w:line="480" w:lineRule="auto" w:after="200"/>
       </w:pPr>
       <w:r>
         <w:rPr>
@@ -227,8 +224,7 @@
     </w:p>
     <w:p>
       <w:pPr>
-        <w:spacing w:line="480" w:lineRule="auto" w:after="0"/>
-        <w:ind w:firstLine="720"/>
+        <w:spacing w:line="480" w:lineRule="auto" w:after="200"/>
       </w:pPr>
       <w:r>
         <w:rPr>
@@ -1117,8 +1113,7 @@
     </w:p>
     <w:p>
       <w:pPr>
-        <w:spacing w:line="480" w:lineRule="auto" w:after="0"/>
-        <w:ind w:firstLine="720"/>
+        <w:spacing w:line="480" w:lineRule="auto" w:after="200"/>
       </w:pPr>
       <w:r>
         <w:rPr>
@@ -1163,8 +1158,7 @@
     </w:p>
     <w:p>
       <w:pPr>
-        <w:spacing w:line="480" w:lineRule="auto" w:after="0"/>
-        <w:ind w:firstLine="720"/>
+        <w:spacing w:line="480" w:lineRule="auto" w:after="200"/>
       </w:pPr>
       <w:r>
         <w:rPr>
@@ -1246,8 +1240,7 @@
     </w:p>
     <w:p>
       <w:pPr>
-        <w:spacing w:line="480" w:lineRule="auto" w:after="0"/>
-        <w:ind w:firstLine="720"/>
+        <w:spacing w:line="480" w:lineRule="auto" w:after="200"/>
       </w:pPr>
       <w:r>
         <w:rPr>
@@ -1261,8 +1254,7 @@
     </w:p>
     <w:p>
       <w:pPr>
-        <w:spacing w:line="480" w:lineRule="auto" w:after="0"/>
-        <w:ind w:firstLine="720"/>
+        <w:spacing w:line="480" w:lineRule="auto" w:after="200"/>
       </w:pPr>
       <w:r>
         <w:rPr>
@@ -1333,8 +1325,7 @@
     </w:p>
     <w:p>
       <w:pPr>
-        <w:spacing w:line="480" w:lineRule="auto" w:after="0"/>
-        <w:ind w:firstLine="720"/>
+        <w:spacing w:line="480" w:lineRule="auto" w:after="200"/>
       </w:pPr>
       <w:r>
         <w:rPr>
@@ -1362,8 +1353,7 @@
     </w:p>
     <w:p>
       <w:pPr>
-        <w:spacing w:line="480" w:lineRule="auto" w:after="0"/>
-        <w:ind w:firstLine="720"/>
+        <w:spacing w:line="480" w:lineRule="auto" w:after="200"/>
       </w:pPr>
       <w:r>
         <w:rPr>
@@ -1377,8 +1367,7 @@
     </w:p>
     <w:p>
       <w:pPr>
-        <w:spacing w:line="480" w:lineRule="auto" w:after="0"/>
-        <w:ind w:firstLine="720"/>
+        <w:spacing w:line="480" w:lineRule="auto" w:after="200"/>
       </w:pPr>
       <w:r>
         <w:rPr>
@@ -1474,8 +1463,7 @@
     </w:p>
     <w:p>
       <w:pPr>
-        <w:spacing w:line="480" w:lineRule="auto" w:after="0"/>
-        <w:ind w:firstLine="720"/>
+        <w:spacing w:line="480" w:lineRule="auto" w:after="200"/>
       </w:pPr>
       <w:r>
         <w:rPr>
@@ -1489,8 +1477,7 @@
     </w:p>
     <w:p>
       <w:pPr>
-        <w:spacing w:line="480" w:lineRule="auto" w:after="0"/>
-        <w:ind w:firstLine="720"/>
+        <w:spacing w:line="480" w:lineRule="auto" w:after="200"/>
       </w:pPr>
       <w:r>
         <w:rPr>
@@ -1518,8 +1505,7 @@
     </w:p>
     <w:p>
       <w:pPr>
-        <w:spacing w:line="480" w:lineRule="auto" w:after="0"/>
-        <w:ind w:firstLine="720"/>
+        <w:spacing w:line="480" w:lineRule="auto" w:after="200"/>
       </w:pPr>
       <w:r>
         <w:rPr>
@@ -1578,8 +1564,7 @@
     </w:p>
     <w:p>
       <w:pPr>
-        <w:spacing w:line="480" w:lineRule="auto" w:after="0"/>
-        <w:ind w:firstLine="720"/>
+        <w:spacing w:line="480" w:lineRule="auto" w:after="200"/>
       </w:pPr>
       <w:r>
         <w:rPr>
@@ -1607,8 +1592,7 @@
     </w:p>
     <w:p>
       <w:pPr>
-        <w:spacing w:line="480" w:lineRule="auto" w:after="0"/>
-        <w:ind w:firstLine="720"/>
+        <w:spacing w:line="480" w:lineRule="auto" w:after="200"/>
       </w:pPr>
       <w:r>
         <w:rPr>
@@ -1637,8 +1621,7 @@
     </w:p>
     <w:p>
       <w:pPr>
-        <w:spacing w:line="480" w:lineRule="auto" w:after="0"/>
-        <w:ind w:firstLine="720"/>
+        <w:spacing w:line="480" w:lineRule="auto" w:after="200"/>
       </w:pPr>
       <w:r>
         <w:rPr>
@@ -2035,8 +2018,7 @@
     </w:p>
     <w:p>
       <w:pPr>
-        <w:spacing w:line="480" w:lineRule="auto" w:after="0"/>
-        <w:ind w:firstLine="720"/>
+        <w:spacing w:line="480" w:lineRule="auto" w:after="200"/>
       </w:pPr>
       <w:r>
         <w:rPr>
@@ -2882,8 +2864,7 @@
     </w:p>
     <w:p>
       <w:pPr>
-        <w:spacing w:line="480" w:lineRule="auto" w:after="0"/>
-        <w:ind w:firstLine="720"/>
+        <w:spacing w:line="480" w:lineRule="auto" w:after="200"/>
       </w:pPr>
       <w:r>
         <w:rPr>
@@ -3404,8 +3385,7 @@
     </w:p>
     <w:p>
       <w:pPr>
-        <w:spacing w:line="480" w:lineRule="auto" w:after="0"/>
-        <w:ind w:firstLine="720"/>
+        <w:spacing w:line="480" w:lineRule="auto" w:after="200"/>
       </w:pPr>
       <w:r>
         <w:rPr>
@@ -3433,8 +3413,7 @@
     </w:p>
     <w:p>
       <w:pPr>
-        <w:spacing w:line="480" w:lineRule="auto" w:after="0"/>
-        <w:ind w:firstLine="720"/>
+        <w:spacing w:line="480" w:lineRule="auto" w:after="200"/>
       </w:pPr>
       <w:r>
         <w:rPr>
@@ -3667,8 +3646,7 @@
     </w:p>
     <w:p>
       <w:pPr>
-        <w:spacing w:line="480" w:lineRule="auto" w:after="0"/>
-        <w:ind w:firstLine="720"/>
+        <w:spacing w:line="480" w:lineRule="auto" w:after="200"/>
       </w:pPr>
       <w:r>
         <w:rPr>
@@ -3696,8 +3674,7 @@
     </w:p>
     <w:p>
       <w:pPr>
-        <w:spacing w:line="480" w:lineRule="auto" w:after="0"/>
-        <w:ind w:firstLine="720"/>
+        <w:spacing w:line="480" w:lineRule="auto" w:after="200"/>
       </w:pPr>
       <w:r>
         <w:rPr>
@@ -4148,8 +4125,7 @@
     </w:p>
     <w:p>
       <w:pPr>
-        <w:spacing w:line="480" w:lineRule="auto" w:after="0"/>
-        <w:ind w:firstLine="720"/>
+        <w:spacing w:line="480" w:lineRule="auto" w:after="200"/>
       </w:pPr>
       <w:r>
         <w:rPr>
@@ -4247,8 +4223,7 @@
     </w:p>
     <w:p>
       <w:pPr>
-        <w:spacing w:line="480" w:lineRule="auto" w:after="0"/>
-        <w:ind w:firstLine="720"/>
+        <w:spacing w:line="480" w:lineRule="auto" w:after="200"/>
       </w:pPr>
       <w:r>
         <w:rPr>
@@ -4276,8 +4251,7 @@
     </w:p>
     <w:p>
       <w:pPr>
-        <w:spacing w:line="480" w:lineRule="auto" w:after="0"/>
-        <w:ind w:firstLine="720"/>
+        <w:spacing w:line="480" w:lineRule="auto" w:after="200"/>
       </w:pPr>
       <w:r>
         <w:rPr>
@@ -4400,8 +4374,7 @@
     </w:p>
     <w:p>
       <w:pPr>
-        <w:spacing w:line="480" w:lineRule="auto" w:after="0"/>
-        <w:ind w:firstLine="720"/>
+        <w:spacing w:line="480" w:lineRule="auto" w:after="200"/>
       </w:pPr>
       <w:r>
         <w:rPr>
@@ -4486,8 +4459,7 @@
     </w:p>
     <w:p>
       <w:pPr>
-        <w:spacing w:line="480" w:lineRule="auto" w:after="0"/>
-        <w:ind w:firstLine="720"/>
+        <w:spacing w:line="480" w:lineRule="auto" w:after="200"/>
       </w:pPr>
       <w:r>
         <w:rPr>
@@ -4572,8 +4544,7 @@
     </w:p>
     <w:p>
       <w:pPr>
-        <w:spacing w:line="480" w:lineRule="auto" w:after="0"/>
-        <w:ind w:firstLine="720"/>
+        <w:spacing w:line="480" w:lineRule="auto" w:after="200"/>
       </w:pPr>
       <w:r>
         <w:rPr>
@@ -4601,8 +4572,7 @@
     </w:p>
     <w:p>
       <w:pPr>
-        <w:spacing w:line="480" w:lineRule="auto" w:after="0"/>
-        <w:ind w:firstLine="720"/>
+        <w:spacing w:line="480" w:lineRule="auto" w:after="200"/>
       </w:pPr>
       <w:r>
         <w:rPr>
@@ -4738,8 +4708,7 @@
     </w:p>
     <w:p>
       <w:pPr>
-        <w:spacing w:line="480" w:lineRule="auto" w:after="0"/>
-        <w:ind w:firstLine="720"/>
+        <w:spacing w:line="480" w:lineRule="auto" w:after="200"/>
       </w:pPr>
       <w:r>
         <w:rPr>
@@ -5459,8 +5428,7 @@
     </w:p>
     <w:p>
       <w:pPr>
-        <w:spacing w:line="480" w:lineRule="auto" w:after="0"/>
-        <w:ind w:firstLine="720"/>
+        <w:spacing w:line="480" w:lineRule="auto" w:after="200"/>
       </w:pPr>
       <w:r>
         <w:rPr>
@@ -5488,8 +5456,7 @@
     </w:p>
     <w:p>
       <w:pPr>
-        <w:spacing w:line="480" w:lineRule="auto" w:after="0"/>
-        <w:ind w:firstLine="720"/>
+        <w:spacing w:line="480" w:lineRule="auto" w:after="200"/>
       </w:pPr>
       <w:r>
         <w:rPr>
@@ -6192,8 +6159,7 @@
     </w:p>
     <w:p>
       <w:pPr>
-        <w:spacing w:line="480" w:lineRule="auto" w:after="0"/>
-        <w:ind w:firstLine="720"/>
+        <w:spacing w:line="480" w:lineRule="auto" w:after="200"/>
       </w:pPr>
       <w:r>
         <w:rPr>
@@ -6221,8 +6187,7 @@
     </w:p>
     <w:p>
       <w:pPr>
-        <w:spacing w:line="480" w:lineRule="auto" w:after="0"/>
-        <w:ind w:firstLine="720"/>
+        <w:spacing w:line="480" w:lineRule="auto" w:after="200"/>
       </w:pPr>
       <w:r>
         <w:rPr>
@@ -6293,8 +6258,7 @@
     </w:p>
     <w:p>
       <w:pPr>
-        <w:spacing w:line="480" w:lineRule="auto" w:after="0"/>
-        <w:ind w:firstLine="720"/>
+        <w:spacing w:line="480" w:lineRule="auto" w:after="200"/>
       </w:pPr>
       <w:r>
         <w:rPr>
@@ -6322,8 +6286,7 @@
     </w:p>
     <w:p>
       <w:pPr>
-        <w:spacing w:line="480" w:lineRule="auto" w:after="0"/>
-        <w:ind w:firstLine="720"/>
+        <w:spacing w:line="480" w:lineRule="auto" w:after="200"/>
       </w:pPr>
       <w:r>
         <w:rPr>
@@ -7948,8 +7911,7 @@
     </w:p>
     <w:p>
       <w:pPr>
-        <w:spacing w:line="480" w:lineRule="auto" w:after="0"/>
-        <w:ind w:firstLine="720"/>
+        <w:spacing w:line="480" w:lineRule="auto" w:after="200"/>
       </w:pPr>
       <w:r>
         <w:rPr>
@@ -7977,8 +7939,7 @@
     </w:p>
     <w:p>
       <w:pPr>
-        <w:spacing w:line="480" w:lineRule="auto" w:after="0"/>
-        <w:ind w:firstLine="720"/>
+        <w:spacing w:line="480" w:lineRule="auto" w:after="200"/>
       </w:pPr>
       <w:r>
         <w:rPr>
@@ -7992,8 +7953,7 @@
     </w:p>
     <w:p>
       <w:pPr>
-        <w:spacing w:line="480" w:lineRule="auto" w:after="0"/>
-        <w:ind w:firstLine="720"/>
+        <w:spacing w:line="480" w:lineRule="auto" w:after="200"/>
       </w:pPr>
       <w:r>
         <w:rPr>
@@ -8022,8 +7982,7 @@
     </w:p>
     <w:p>
       <w:pPr>
-        <w:spacing w:line="480" w:lineRule="auto" w:after="0"/>
-        <w:ind w:firstLine="720"/>
+        <w:spacing w:line="480" w:lineRule="auto" w:after="200"/>
       </w:pPr>
       <w:r>
         <w:rPr>
@@ -8037,8 +7996,7 @@
     </w:p>
     <w:p>
       <w:pPr>
-        <w:spacing w:line="480" w:lineRule="auto" w:after="0"/>
-        <w:ind w:firstLine="720"/>
+        <w:spacing w:line="480" w:lineRule="auto" w:after="200"/>
       </w:pPr>
       <w:r>
         <w:rPr>
@@ -8052,8 +8010,7 @@
     </w:p>
     <w:p>
       <w:pPr>
-        <w:spacing w:line="480" w:lineRule="auto" w:after="0"/>
-        <w:ind w:firstLine="720"/>
+        <w:spacing w:line="480" w:lineRule="auto" w:after="200"/>
       </w:pPr>
       <w:r>
         <w:rPr>
@@ -8232,8 +8189,7 @@
     </w:p>
     <w:p>
       <w:pPr>
-        <w:spacing w:line="480" w:lineRule="auto" w:after="0"/>
-        <w:ind w:firstLine="720"/>
+        <w:spacing w:line="480" w:lineRule="auto" w:after="200"/>
       </w:pPr>
       <w:r>
         <w:rPr>
@@ -8262,8 +8218,7 @@
     </w:p>
     <w:p>
       <w:pPr>
-        <w:spacing w:line="480" w:lineRule="auto" w:after="0"/>
-        <w:ind w:firstLine="720"/>
+        <w:spacing w:line="480" w:lineRule="auto" w:after="200"/>
       </w:pPr>
       <w:r>
         <w:rPr>
@@ -8292,8 +8247,7 @@
     </w:p>
     <w:p>
       <w:pPr>
-        <w:spacing w:line="480" w:lineRule="auto" w:after="0"/>
-        <w:ind w:firstLine="720"/>
+        <w:spacing w:line="480" w:lineRule="auto" w:after="200"/>
       </w:pPr>
       <w:r>
         <w:rPr>

</xml_diff>